<commit_message>
Writing Ariticles and update daily Cartoon
</commit_message>
<xml_diff>
--- a/Articles/2026/4_Blender_Tips_and_Tricks/14_Changing_the_Colors_of_Elements_in_the_Viewport/14 Changing the Colors of Elements in the Viewport.docx
+++ b/Articles/2026/4_Blender_Tips_and_Tricks/14_Changing_the_Colors_of_Elements_in_the_Viewport/14 Changing the Colors of Elements in the Viewport.docx
@@ -15,6 +15,72 @@
         <w:t>12/7/2026</w:t>
       </w:r>
     </w:p>
+    <w:p/>
+    <w:p>
+      <w:r>
+        <w:rPr>
+          <w:noProof/>
+        </w:rPr>
+        <w:drawing>
+          <wp:inline distT="0" distB="0" distL="0" distR="0" wp14:anchorId="20FD2750" wp14:editId="4F2B00CA">
+            <wp:extent cx="3098800" cy="2762969"/>
+            <wp:effectExtent l="76200" t="76200" r="139700" b="132715"/>
+            <wp:docPr id="767881213" name="Picture 1"/>
+            <wp:cNvGraphicFramePr>
+              <a:graphicFrameLocks xmlns:a="http://schemas.openxmlformats.org/drawingml/2006/main" noChangeAspect="1"/>
+            </wp:cNvGraphicFramePr>
+            <a:graphic xmlns:a="http://schemas.openxmlformats.org/drawingml/2006/main">
+              <a:graphicData uri="http://schemas.openxmlformats.org/drawingml/2006/picture">
+                <pic:pic xmlns:pic="http://schemas.openxmlformats.org/drawingml/2006/picture">
+                  <pic:nvPicPr>
+                    <pic:cNvPr id="0" name="Picture 1"/>
+                    <pic:cNvPicPr>
+                      <a:picLocks noChangeAspect="1" noChangeArrowheads="1"/>
+                    </pic:cNvPicPr>
+                  </pic:nvPicPr>
+                  <pic:blipFill>
+                    <a:blip r:embed="rId5">
+                      <a:extLst>
+                        <a:ext uri="{28A0092B-C50C-407E-A947-70E740481C1C}">
+                          <a14:useLocalDpi xmlns:a14="http://schemas.microsoft.com/office/drawing/2010/main" val="0"/>
+                        </a:ext>
+                      </a:extLst>
+                    </a:blip>
+                    <a:srcRect/>
+                    <a:stretch>
+                      <a:fillRect/>
+                    </a:stretch>
+                  </pic:blipFill>
+                  <pic:spPr bwMode="auto">
+                    <a:xfrm>
+                      <a:off x="0" y="0"/>
+                      <a:ext cx="3100681" cy="2764646"/>
+                    </a:xfrm>
+                    <a:prstGeom prst="rect">
+                      <a:avLst/>
+                    </a:prstGeom>
+                    <a:ln w="38100" cap="sq">
+                      <a:solidFill>
+                        <a:srgbClr val="000000"/>
+                      </a:solidFill>
+                      <a:prstDash val="solid"/>
+                      <a:miter lim="800000"/>
+                    </a:ln>
+                    <a:effectLst>
+                      <a:outerShdw blurRad="50800" dist="38100" dir="2700000" algn="tl" rotWithShape="0">
+                        <a:srgbClr val="000000">
+                          <a:alpha val="43000"/>
+                        </a:srgbClr>
+                      </a:outerShdw>
+                    </a:effectLst>
+                  </pic:spPr>
+                </pic:pic>
+              </a:graphicData>
+            </a:graphic>
+          </wp:inline>
+        </w:drawing>
+      </w:r>
+    </w:p>
     <w:p>
       <w:r>
         <w:t>Edit → Preferences → Themes → 3D Viewport</w:t>
@@ -22,10 +88,14 @@
     </w:p>
     <w:p>
       <w:r>
-        <w:t>Wire changes the color of the Parent line.</w:t>
+        <w:t>The Wire setting changes the color of the parenting lines</w:t>
       </w:r>
-    </w:p>
-    <w:p>
+      <w:r>
+        <w:t>,</w:t>
+      </w:r>
+      <w:r>
+        <w:t xml:space="preserve"> and the armature wire display in the 3D Viewport.</w:t>
+      </w:r>
       <w:r>
         <w:rPr>
           <w:noProof/>
@@ -46,7 +116,7 @@
                     <pic:cNvPicPr/>
                   </pic:nvPicPr>
                   <pic:blipFill>
-                    <a:blip r:embed="rId5"/>
+                    <a:blip r:embed="rId6"/>
                     <a:stretch>
                       <a:fillRect/>
                     </a:stretch>
@@ -74,9 +144,9 @@
         </w:rPr>
         <w:lastRenderedPageBreak/>
         <w:drawing>
-          <wp:inline distT="0" distB="0" distL="0" distR="0" wp14:anchorId="6C360911" wp14:editId="026D2942">
-            <wp:extent cx="4048783" cy="3686175"/>
-            <wp:effectExtent l="76200" t="76200" r="142240" b="123825"/>
+          <wp:inline distT="0" distB="0" distL="0" distR="0" wp14:anchorId="6C360911" wp14:editId="13046B51">
+            <wp:extent cx="3944164" cy="3590925"/>
+            <wp:effectExtent l="76200" t="76200" r="132715" b="123825"/>
             <wp:docPr id="864838523" name="Picture 1"/>
             <wp:cNvGraphicFramePr>
               <a:graphicFrameLocks xmlns:a="http://schemas.openxmlformats.org/drawingml/2006/main" noChangeAspect="1"/>
@@ -89,7 +159,7 @@
                     <pic:cNvPicPr/>
                   </pic:nvPicPr>
                   <pic:blipFill rotWithShape="1">
-                    <a:blip r:embed="rId6"/>
+                    <a:blip r:embed="rId7"/>
                     <a:srcRect l="57532" t="28252"/>
                     <a:stretch>
                       <a:fillRect/>
@@ -98,7 +168,7 @@
                   <pic:spPr bwMode="auto">
                     <a:xfrm>
                       <a:off x="0" y="0"/>
-                      <a:ext cx="4056293" cy="3693012"/>
+                      <a:ext cx="3959822" cy="3605180"/>
                     </a:xfrm>
                     <a:prstGeom prst="rect">
                       <a:avLst/>
@@ -132,15 +202,19 @@
     </w:p>
     <w:p>
       <w:r>
-        <w:t>Watch it, this setting will also change the outline of the bones in edit mode, if you make the color bright red, whenever you view the bones, you might think “Oh No, red I must have done something wrong”</w:t>
+        <w:rPr>
+          <w:rStyle w:val="BoldRedChar"/>
+        </w:rPr>
+        <w:t>Watch It</w:t>
+      </w:r>
+      <w:r>
+        <w:t xml:space="preserve"> — This setting can also change the outline color of bones while working in Edit Mode. If you choose a very bright color, you may occasionally look at the bones and think, “Oh no, red! I must have done something wrong.</w:t>
       </w:r>
     </w:p>
     <w:p>
       <w:r>
-        <w:t>This Teal color works for both the parenting and the armature</w:t>
+        <w:t>I chose this teal color because it works well for both the parenting lines and the armature display.</w:t>
       </w:r>
-    </w:p>
-    <w:p>
       <w:r>
         <w:rPr>
           <w:noProof/>
@@ -161,7 +235,7 @@
                     <pic:cNvPicPr/>
                   </pic:nvPicPr>
                   <pic:blipFill>
-                    <a:blip r:embed="rId7"/>
+                    <a:blip r:embed="rId8"/>
                     <a:stretch>
                       <a:fillRect/>
                     </a:stretch>

</xml_diff>